<commit_message>
include fuzzy match examples
</commit_message>
<xml_diff>
--- a/incorrect.docx
+++ b/incorrect.docx
@@ -150,6 +150,22 @@
           <w:rStyle w:val="FootnoteReference"/>
         </w:rPr>
         <w:footnoteReference w:id="1"/>
+      </w:r>
+    </w:p>
+    <w:p>
+      <w:pPr>
+        <w:pStyle w:val="NoSpacing"/>
+      </w:pPr>
+      <w:r>
+        <w:t>ABC.001.001.0045</w:t>
+      </w:r>
+    </w:p>
+    <w:p>
+      <w:pPr>
+        <w:pStyle w:val="NoSpacing"/>
+      </w:pPr>
+      <w:r>
+        <w:t>XYZ.002.005.0110</w:t>
       </w:r>
     </w:p>
     <w:sectPr>
@@ -221,10 +237,7 @@
         <w:footnoteRef/>
       </w:r>
       <w:r>
-        <w:t xml:space="preserve"> </w:t>
-      </w:r>
-      <w:r>
-        <w:t>ABC.001.001.0030</w:t>
+        <w:t xml:space="preserve"> ABC.001.001.0030</w:t>
       </w:r>
     </w:p>
   </w:footnote>

</xml_diff>